<commit_message>
Fit 자기소개서 table to one page and isolate consent form on its own page
</commit_message>
<xml_diff>
--- a/이재용_자기소개서.docx
+++ b/이재용_자기소개서.docx
@@ -8144,7 +8144,7 @@
             <w:pPr>
               <w:pStyle w:val="Style15"/>
               <w:snapToGrid w:val="false"/>
-              <w:spacing w:lineRule="auto" w:line="336" w:before="0" w:after="120"/>
+              <w:spacing w:lineRule="auto" w:line="252" w:before="0" w:after="60"/>
               <w:rPr>
                 <w:rFonts w:ascii="맑은 고딕" w:hAnsi="맑은 고딕" w:eastAsia="맑은 고딕" w:cs="맑은 고딕"/>
                 <w:b/>
@@ -8164,7 +8164,8 @@
           </w:p>
           <w:p>
             <w:pPr>
-              <w:spacing w:after="120" w:line="336" w:lineRule="auto"/>
+              <w:snapToGrid w:val="false"/>
+              <w:spacing w:after="60" w:line="252" w:lineRule="auto"/>
             </w:pPr>
             <w:r>
               <w:rPr>
@@ -8176,7 +8177,8 @@
           </w:p>
           <w:p>
             <w:pPr>
-              <w:spacing w:after="120" w:line="336" w:lineRule="auto"/>
+              <w:snapToGrid w:val="false"/>
+              <w:spacing w:after="60" w:line="252" w:lineRule="auto"/>
             </w:pPr>
             <w:r>
               <w:rPr>
@@ -8188,7 +8190,8 @@
           </w:p>
           <w:p>
             <w:pPr>
-              <w:spacing w:after="120" w:line="336" w:lineRule="auto"/>
+              <w:snapToGrid w:val="false"/>
+              <w:spacing w:after="60" w:line="252" w:lineRule="auto"/>
             </w:pPr>
             <w:r>
               <w:rPr>
@@ -8262,7 +8265,7 @@
             <w:pPr>
               <w:pStyle w:val="Normal"/>
               <w:snapToGrid w:val="false"/>
-              <w:spacing w:after="60" w:line="276" w:lineRule="auto"/>
+              <w:spacing w:after="60" w:line="252" w:lineRule="auto"/>
               <w:jc w:val="start"/>
               <w:rPr>
                 <w:rFonts w:ascii="맑은 고딕" w:hAnsi="맑은 고딕" w:eastAsia="맑은 고딕" w:cs="맑은 고딕"/>
@@ -8283,7 +8286,7 @@
           <w:p>
             <w:pPr>
               <w:snapToGrid w:val="false"/>
-              <w:spacing w:after="60" w:line="276" w:lineRule="auto"/>
+              <w:spacing w:after="60" w:line="252" w:lineRule="auto"/>
             </w:pPr>
             <w:r>
               <w:rPr>
@@ -8296,7 +8299,7 @@
           <w:p>
             <w:pPr>
               <w:snapToGrid w:val="false"/>
-              <w:spacing w:after="60" w:line="276" w:lineRule="auto"/>
+              <w:spacing w:after="60" w:line="252" w:lineRule="auto"/>
             </w:pPr>
             <w:r>
               <w:rPr>
@@ -8309,7 +8312,7 @@
           <w:p>
             <w:pPr>
               <w:snapToGrid w:val="false"/>
-              <w:spacing w:after="60" w:line="276" w:lineRule="auto"/>
+              <w:spacing w:after="60" w:line="252" w:lineRule="auto"/>
             </w:pPr>
             <w:r>
               <w:rPr>
@@ -8322,7 +8325,7 @@
           <w:p>
             <w:pPr>
               <w:snapToGrid w:val="false"/>
-              <w:spacing w:after="60" w:line="276" w:lineRule="auto"/>
+              <w:spacing w:after="60" w:line="252" w:lineRule="auto"/>
             </w:pPr>
             <w:r>
               <w:rPr>
@@ -8406,7 +8409,7 @@
             <w:pPr>
               <w:pStyle w:val="Normal"/>
               <w:snapToGrid w:val="false"/>
-              <w:spacing w:after="120" w:line="336" w:lineRule="auto"/>
+              <w:spacing w:after="60" w:line="252" w:lineRule="auto"/>
               <w:jc w:val="start"/>
               <w:rPr>
                 <w:rFonts w:ascii="맑은 고딕" w:hAnsi="맑은 고딕" w:eastAsia="맑은 고딕" w:cs="맑은 고딕"/>
@@ -8426,7 +8429,8 @@
           </w:p>
           <w:p>
             <w:pPr>
-              <w:spacing w:after="120" w:line="336" w:lineRule="auto"/>
+              <w:snapToGrid w:val="false"/>
+              <w:spacing w:after="60" w:line="252" w:lineRule="auto"/>
             </w:pPr>
             <w:r>
               <w:rPr>
@@ -8438,7 +8442,8 @@
           </w:p>
           <w:p>
             <w:pPr>
-              <w:spacing w:after="120" w:line="336" w:lineRule="auto"/>
+              <w:snapToGrid w:val="false"/>
+              <w:spacing w:after="60" w:line="252" w:lineRule="auto"/>
             </w:pPr>
             <w:r>
               <w:rPr>
@@ -8477,6 +8482,7 @@
     <w:p>
       <w:pPr>
         <w:pStyle w:val="Normal"/>
+        <w:pageBreakBefore/>
         <w:spacing w:before="26" w:after="0"/>
         <w:ind w:start="3009" w:end="205"/>
         <w:rPr>

</xml_diff>